<commit_message>
Selektywny wydruk: multiselect grupa/zawodnik (expander w sekcji 5, opcjonalny) + nowy IND_Grupa z numerami kolejek rzutowych
</commit_message>
<xml_diff>
--- a/IND_Grupa.docx
+++ b/IND_Grupa.docx
@@ -981,11 +981,12 @@
           <w:bottom w:val="single" w:sz="6" w:space="0" w:color="auto"/>
           <w:right w:val="single" w:sz="6" w:space="0" w:color="auto"/>
         </w:tblBorders>
+        <w:tblLayout w:type="fixed"/>
         <w:tblLook w:val="04A0" w:firstRow="1" w:lastRow="0" w:firstColumn="1" w:lastColumn="0" w:noHBand="0" w:noVBand="1"/>
       </w:tblPr>
       <w:tblGrid>
-        <w:gridCol w:w="2694"/>
-        <w:gridCol w:w="780"/>
+        <w:gridCol w:w="2880"/>
+        <w:gridCol w:w="576"/>
         <w:gridCol w:w="668"/>
         <w:gridCol w:w="668"/>
         <w:gridCol w:w="668"/>
@@ -1002,7 +1003,7 @@
         </w:trPr>
         <w:tc>
           <w:tcPr>
-            <w:tcW w:w="2694" w:type="dxa"/>
+            <w:tcW w:w="2880" w:type="dxa"/>
             <w:tcBorders>
               <w:top w:val="nil"/>
               <w:left w:val="nil"/>
@@ -1028,7 +1029,7 @@
         </w:tc>
         <w:tc>
           <w:tcPr>
-            <w:tcW w:w="780" w:type="dxa"/>
+            <w:tcW w:w="576" w:type="dxa"/>
             <w:tcBorders>
               <w:left w:val="single" w:sz="4" w:space="0" w:color="auto"/>
             </w:tcBorders>
@@ -1123,7 +1124,7 @@
         </w:trPr>
         <w:tc>
           <w:tcPr>
-            <w:tcW w:w="2694" w:type="dxa"/>
+            <w:tcW w:w="2880" w:type="dxa"/>
             <w:tcBorders>
               <w:top w:val="nil"/>
               <w:left w:val="nil"/>
@@ -1161,7 +1162,7 @@
         </w:tc>
         <w:tc>
           <w:tcPr>
-            <w:tcW w:w="780" w:type="dxa"/>
+            <w:tcW w:w="576" w:type="dxa"/>
             <w:tcBorders>
               <w:left w:val="single" w:sz="4" w:space="0" w:color="auto"/>
             </w:tcBorders>
@@ -1400,7 +1401,7 @@
         </w:trPr>
         <w:tc>
           <w:tcPr>
-            <w:tcW w:w="2694" w:type="dxa"/>
+            <w:tcW w:w="2880" w:type="dxa"/>
             <w:tcBorders>
               <w:top w:val="nil"/>
               <w:left w:val="nil"/>
@@ -1426,7 +1427,7 @@
         </w:tc>
         <w:tc>
           <w:tcPr>
-            <w:tcW w:w="780" w:type="dxa"/>
+            <w:tcW w:w="576" w:type="dxa"/>
             <w:tcBorders>
               <w:left w:val="single" w:sz="4" w:space="0" w:color="auto"/>
             </w:tcBorders>
@@ -1434,16 +1435,27 @@
               <w:left w:w="105" w:type="dxa"/>
               <w:right w:w="105" w:type="dxa"/>
             </w:tcMar>
-          </w:tcPr>
-          <w:p>
-            <w:pPr>
-              <w:rPr>
-                <w:rFonts w:ascii="Aptos Narrow" w:eastAsia="Aptos Narrow" w:hAnsi="Aptos Narrow" w:cs="Aptos Narrow"/>
-                <w:color w:val="000000" w:themeColor="text1"/>
-                <w:sz w:val="20"/>
-                <w:szCs w:val="20"/>
-              </w:rPr>
-            </w:pPr>
+            <w:vAlign w:val="center"/>
+          </w:tcPr>
+          <w:p>
+            <w:pPr>
+              <w:jc w:val="center"/>
+              <w:rPr>
+                <w:rFonts w:ascii="Aptos Narrow" w:eastAsia="Aptos Narrow" w:hAnsi="Aptos Narrow" w:cs="Aptos Narrow"/>
+                <w:color w:val="000000" w:themeColor="text1"/>
+                <w:sz w:val="20"/>
+                <w:szCs w:val="20"/>
+              </w:rPr>
+            </w:pPr>
+            <w:r>
+              <w:rPr>
+                <w:rFonts w:ascii="Aptos Narrow" w:eastAsia="Aptos Narrow" w:hAnsi="Aptos Narrow" w:cs="Aptos Narrow"/>
+                <w:color w:val="000000" w:themeColor="text1"/>
+                <w:sz w:val="20"/>
+                <w:szCs w:val="20"/>
+              </w:rPr>
+              <w:t>1</w:t>
+            </w:r>
           </w:p>
         </w:tc>
         <w:tc>
@@ -1618,7 +1630,7 @@
         </w:trPr>
         <w:tc>
           <w:tcPr>
-            <w:tcW w:w="2694" w:type="dxa"/>
+            <w:tcW w:w="2880" w:type="dxa"/>
             <w:tcBorders>
               <w:top w:val="nil"/>
               <w:left w:val="nil"/>
@@ -1644,7 +1656,7 @@
         </w:tc>
         <w:tc>
           <w:tcPr>
-            <w:tcW w:w="780" w:type="dxa"/>
+            <w:tcW w:w="576" w:type="dxa"/>
             <w:tcBorders>
               <w:left w:val="single" w:sz="4" w:space="0" w:color="auto"/>
             </w:tcBorders>
@@ -1652,17 +1664,27 @@
               <w:left w:w="105" w:type="dxa"/>
               <w:right w:w="105" w:type="dxa"/>
             </w:tcMar>
-          </w:tcPr>
-          <w:p>
-            <w:pPr>
-              <w:jc w:val="center"/>
-              <w:rPr>
-                <w:rFonts w:ascii="Aptos Narrow" w:eastAsia="Aptos Narrow" w:hAnsi="Aptos Narrow" w:cs="Aptos Narrow"/>
-                <w:color w:val="000000" w:themeColor="text1"/>
-                <w:sz w:val="20"/>
-                <w:szCs w:val="20"/>
-              </w:rPr>
-            </w:pPr>
+            <w:vAlign w:val="center"/>
+          </w:tcPr>
+          <w:p>
+            <w:pPr>
+              <w:jc w:val="center"/>
+              <w:rPr>
+                <w:rFonts w:ascii="Aptos Narrow" w:eastAsia="Aptos Narrow" w:hAnsi="Aptos Narrow" w:cs="Aptos Narrow"/>
+                <w:color w:val="000000" w:themeColor="text1"/>
+                <w:sz w:val="20"/>
+                <w:szCs w:val="20"/>
+              </w:rPr>
+            </w:pPr>
+            <w:r>
+              <w:rPr>
+                <w:rFonts w:ascii="Aptos Narrow" w:eastAsia="Aptos Narrow" w:hAnsi="Aptos Narrow" w:cs="Aptos Narrow"/>
+                <w:color w:val="000000" w:themeColor="text1"/>
+                <w:sz w:val="20"/>
+                <w:szCs w:val="20"/>
+              </w:rPr>
+              <w:t>2</w:t>
+            </w:r>
           </w:p>
         </w:tc>
         <w:tc>
@@ -1837,7 +1859,7 @@
         </w:trPr>
         <w:tc>
           <w:tcPr>
-            <w:tcW w:w="2694" w:type="dxa"/>
+            <w:tcW w:w="2880" w:type="dxa"/>
             <w:tcBorders>
               <w:top w:val="nil"/>
               <w:left w:val="nil"/>
@@ -1863,7 +1885,7 @@
         </w:tc>
         <w:tc>
           <w:tcPr>
-            <w:tcW w:w="780" w:type="dxa"/>
+            <w:tcW w:w="576" w:type="dxa"/>
             <w:tcBorders>
               <w:left w:val="single" w:sz="4" w:space="0" w:color="auto"/>
             </w:tcBorders>
@@ -1871,17 +1893,27 @@
               <w:left w:w="105" w:type="dxa"/>
               <w:right w:w="105" w:type="dxa"/>
             </w:tcMar>
-          </w:tcPr>
-          <w:p>
-            <w:pPr>
-              <w:jc w:val="center"/>
-              <w:rPr>
-                <w:rFonts w:ascii="Aptos Narrow" w:eastAsia="Aptos Narrow" w:hAnsi="Aptos Narrow" w:cs="Aptos Narrow"/>
-                <w:color w:val="000000" w:themeColor="text1"/>
-                <w:sz w:val="20"/>
-                <w:szCs w:val="20"/>
-              </w:rPr>
-            </w:pPr>
+            <w:vAlign w:val="center"/>
+          </w:tcPr>
+          <w:p>
+            <w:pPr>
+              <w:jc w:val="center"/>
+              <w:rPr>
+                <w:rFonts w:ascii="Aptos Narrow" w:eastAsia="Aptos Narrow" w:hAnsi="Aptos Narrow" w:cs="Aptos Narrow"/>
+                <w:color w:val="000000" w:themeColor="text1"/>
+                <w:sz w:val="20"/>
+                <w:szCs w:val="20"/>
+              </w:rPr>
+            </w:pPr>
+            <w:r>
+              <w:rPr>
+                <w:rFonts w:ascii="Aptos Narrow" w:eastAsia="Aptos Narrow" w:hAnsi="Aptos Narrow" w:cs="Aptos Narrow"/>
+                <w:color w:val="000000" w:themeColor="text1"/>
+                <w:sz w:val="20"/>
+                <w:szCs w:val="20"/>
+              </w:rPr>
+              <w:t>3</w:t>
+            </w:r>
           </w:p>
         </w:tc>
         <w:tc>
@@ -2056,7 +2088,7 @@
         </w:trPr>
         <w:tc>
           <w:tcPr>
-            <w:tcW w:w="2694" w:type="dxa"/>
+            <w:tcW w:w="2880" w:type="dxa"/>
             <w:tcBorders>
               <w:top w:val="nil"/>
               <w:left w:val="nil"/>
@@ -2082,7 +2114,7 @@
         </w:tc>
         <w:tc>
           <w:tcPr>
-            <w:tcW w:w="780" w:type="dxa"/>
+            <w:tcW w:w="576" w:type="dxa"/>
             <w:tcBorders>
               <w:left w:val="single" w:sz="4" w:space="0" w:color="auto"/>
             </w:tcBorders>
@@ -2090,17 +2122,27 @@
               <w:left w:w="105" w:type="dxa"/>
               <w:right w:w="105" w:type="dxa"/>
             </w:tcMar>
-          </w:tcPr>
-          <w:p>
-            <w:pPr>
-              <w:jc w:val="center"/>
-              <w:rPr>
-                <w:rFonts w:ascii="Aptos Narrow" w:eastAsia="Aptos Narrow" w:hAnsi="Aptos Narrow" w:cs="Aptos Narrow"/>
-                <w:color w:val="000000" w:themeColor="text1"/>
-                <w:sz w:val="20"/>
-                <w:szCs w:val="20"/>
-              </w:rPr>
-            </w:pPr>
+            <w:vAlign w:val="center"/>
+          </w:tcPr>
+          <w:p>
+            <w:pPr>
+              <w:jc w:val="center"/>
+              <w:rPr>
+                <w:rFonts w:ascii="Aptos Narrow" w:eastAsia="Aptos Narrow" w:hAnsi="Aptos Narrow" w:cs="Aptos Narrow"/>
+                <w:color w:val="000000" w:themeColor="text1"/>
+                <w:sz w:val="20"/>
+                <w:szCs w:val="20"/>
+              </w:rPr>
+            </w:pPr>
+            <w:r>
+              <w:rPr>
+                <w:rFonts w:ascii="Aptos Narrow" w:eastAsia="Aptos Narrow" w:hAnsi="Aptos Narrow" w:cs="Aptos Narrow"/>
+                <w:color w:val="000000" w:themeColor="text1"/>
+                <w:sz w:val="20"/>
+                <w:szCs w:val="20"/>
+              </w:rPr>
+              <w:t>4</w:t>
+            </w:r>
           </w:p>
         </w:tc>
         <w:tc>
@@ -2275,7 +2317,7 @@
         </w:trPr>
         <w:tc>
           <w:tcPr>
-            <w:tcW w:w="2694" w:type="dxa"/>
+            <w:tcW w:w="2880" w:type="dxa"/>
             <w:tcBorders>
               <w:top w:val="nil"/>
               <w:left w:val="nil"/>
@@ -2301,7 +2343,7 @@
         </w:tc>
         <w:tc>
           <w:tcPr>
-            <w:tcW w:w="780" w:type="dxa"/>
+            <w:tcW w:w="576" w:type="dxa"/>
             <w:tcBorders>
               <w:left w:val="single" w:sz="4" w:space="0" w:color="auto"/>
             </w:tcBorders>
@@ -2309,17 +2351,27 @@
               <w:left w:w="105" w:type="dxa"/>
               <w:right w:w="105" w:type="dxa"/>
             </w:tcMar>
-          </w:tcPr>
-          <w:p>
-            <w:pPr>
-              <w:jc w:val="center"/>
-              <w:rPr>
-                <w:rFonts w:ascii="Aptos Narrow" w:eastAsia="Aptos Narrow" w:hAnsi="Aptos Narrow" w:cs="Aptos Narrow"/>
-                <w:color w:val="000000" w:themeColor="text1"/>
-                <w:sz w:val="20"/>
-                <w:szCs w:val="20"/>
-              </w:rPr>
-            </w:pPr>
+            <w:vAlign w:val="center"/>
+          </w:tcPr>
+          <w:p>
+            <w:pPr>
+              <w:jc w:val="center"/>
+              <w:rPr>
+                <w:rFonts w:ascii="Aptos Narrow" w:eastAsia="Aptos Narrow" w:hAnsi="Aptos Narrow" w:cs="Aptos Narrow"/>
+                <w:color w:val="000000" w:themeColor="text1"/>
+                <w:sz w:val="20"/>
+                <w:szCs w:val="20"/>
+              </w:rPr>
+            </w:pPr>
+            <w:r>
+              <w:rPr>
+                <w:rFonts w:ascii="Aptos Narrow" w:eastAsia="Aptos Narrow" w:hAnsi="Aptos Narrow" w:cs="Aptos Narrow"/>
+                <w:color w:val="000000" w:themeColor="text1"/>
+                <w:sz w:val="20"/>
+                <w:szCs w:val="20"/>
+              </w:rPr>
+              <w:t>5</w:t>
+            </w:r>
           </w:p>
         </w:tc>
         <w:tc>
@@ -2494,7 +2546,7 @@
         </w:trPr>
         <w:tc>
           <w:tcPr>
-            <w:tcW w:w="2694" w:type="dxa"/>
+            <w:tcW w:w="2880" w:type="dxa"/>
             <w:tcBorders>
               <w:top w:val="nil"/>
               <w:left w:val="nil"/>
@@ -2520,7 +2572,7 @@
         </w:tc>
         <w:tc>
           <w:tcPr>
-            <w:tcW w:w="780" w:type="dxa"/>
+            <w:tcW w:w="576" w:type="dxa"/>
             <w:tcBorders>
               <w:left w:val="single" w:sz="4" w:space="0" w:color="auto"/>
             </w:tcBorders>
@@ -2528,17 +2580,27 @@
               <w:left w:w="105" w:type="dxa"/>
               <w:right w:w="105" w:type="dxa"/>
             </w:tcMar>
-          </w:tcPr>
-          <w:p>
-            <w:pPr>
-              <w:jc w:val="center"/>
-              <w:rPr>
-                <w:rFonts w:ascii="Aptos Narrow" w:eastAsia="Aptos Narrow" w:hAnsi="Aptos Narrow" w:cs="Aptos Narrow"/>
-                <w:color w:val="000000" w:themeColor="text1"/>
-                <w:sz w:val="20"/>
-                <w:szCs w:val="20"/>
-              </w:rPr>
-            </w:pPr>
+            <w:vAlign w:val="center"/>
+          </w:tcPr>
+          <w:p>
+            <w:pPr>
+              <w:jc w:val="center"/>
+              <w:rPr>
+                <w:rFonts w:ascii="Aptos Narrow" w:eastAsia="Aptos Narrow" w:hAnsi="Aptos Narrow" w:cs="Aptos Narrow"/>
+                <w:color w:val="000000" w:themeColor="text1"/>
+                <w:sz w:val="20"/>
+                <w:szCs w:val="20"/>
+              </w:rPr>
+            </w:pPr>
+            <w:r>
+              <w:rPr>
+                <w:rFonts w:ascii="Aptos Narrow" w:eastAsia="Aptos Narrow" w:hAnsi="Aptos Narrow" w:cs="Aptos Narrow"/>
+                <w:color w:val="000000" w:themeColor="text1"/>
+                <w:sz w:val="20"/>
+                <w:szCs w:val="20"/>
+              </w:rPr>
+              <w:t>6</w:t>
+            </w:r>
           </w:p>
         </w:tc>
         <w:tc>
@@ -2713,7 +2775,7 @@
         </w:trPr>
         <w:tc>
           <w:tcPr>
-            <w:tcW w:w="2694" w:type="dxa"/>
+            <w:tcW w:w="2880" w:type="dxa"/>
             <w:tcBorders>
               <w:top w:val="nil"/>
               <w:left w:val="nil"/>
@@ -2739,7 +2801,7 @@
         </w:tc>
         <w:tc>
           <w:tcPr>
-            <w:tcW w:w="780" w:type="dxa"/>
+            <w:tcW w:w="576" w:type="dxa"/>
             <w:tcBorders>
               <w:left w:val="single" w:sz="4" w:space="0" w:color="auto"/>
             </w:tcBorders>
@@ -2747,17 +2809,27 @@
               <w:left w:w="105" w:type="dxa"/>
               <w:right w:w="105" w:type="dxa"/>
             </w:tcMar>
-          </w:tcPr>
-          <w:p>
-            <w:pPr>
-              <w:jc w:val="center"/>
-              <w:rPr>
-                <w:rFonts w:ascii="Aptos Narrow" w:eastAsia="Aptos Narrow" w:hAnsi="Aptos Narrow" w:cs="Aptos Narrow"/>
-                <w:color w:val="000000" w:themeColor="text1"/>
-                <w:sz w:val="20"/>
-                <w:szCs w:val="20"/>
-              </w:rPr>
-            </w:pPr>
+            <w:vAlign w:val="center"/>
+          </w:tcPr>
+          <w:p>
+            <w:pPr>
+              <w:jc w:val="center"/>
+              <w:rPr>
+                <w:rFonts w:ascii="Aptos Narrow" w:eastAsia="Aptos Narrow" w:hAnsi="Aptos Narrow" w:cs="Aptos Narrow"/>
+                <w:color w:val="000000" w:themeColor="text1"/>
+                <w:sz w:val="20"/>
+                <w:szCs w:val="20"/>
+              </w:rPr>
+            </w:pPr>
+            <w:r>
+              <w:rPr>
+                <w:rFonts w:ascii="Aptos Narrow" w:eastAsia="Aptos Narrow" w:hAnsi="Aptos Narrow" w:cs="Aptos Narrow"/>
+                <w:color w:val="000000" w:themeColor="text1"/>
+                <w:sz w:val="20"/>
+                <w:szCs w:val="20"/>
+              </w:rPr>
+              <w:t>7</w:t>
+            </w:r>
           </w:p>
         </w:tc>
         <w:tc>
@@ -2932,7 +3004,7 @@
         </w:trPr>
         <w:tc>
           <w:tcPr>
-            <w:tcW w:w="2694" w:type="dxa"/>
+            <w:tcW w:w="2880" w:type="dxa"/>
             <w:tcBorders>
               <w:top w:val="nil"/>
               <w:left w:val="nil"/>
@@ -2958,7 +3030,7 @@
         </w:tc>
         <w:tc>
           <w:tcPr>
-            <w:tcW w:w="780" w:type="dxa"/>
+            <w:tcW w:w="576" w:type="dxa"/>
             <w:tcBorders>
               <w:left w:val="single" w:sz="4" w:space="0" w:color="auto"/>
             </w:tcBorders>
@@ -2966,17 +3038,27 @@
               <w:left w:w="105" w:type="dxa"/>
               <w:right w:w="105" w:type="dxa"/>
             </w:tcMar>
-          </w:tcPr>
-          <w:p>
-            <w:pPr>
-              <w:jc w:val="center"/>
-              <w:rPr>
-                <w:rFonts w:ascii="Aptos Narrow" w:eastAsia="Aptos Narrow" w:hAnsi="Aptos Narrow" w:cs="Aptos Narrow"/>
-                <w:color w:val="000000" w:themeColor="text1"/>
-                <w:sz w:val="20"/>
-                <w:szCs w:val="20"/>
-              </w:rPr>
-            </w:pPr>
+            <w:vAlign w:val="center"/>
+          </w:tcPr>
+          <w:p>
+            <w:pPr>
+              <w:jc w:val="center"/>
+              <w:rPr>
+                <w:rFonts w:ascii="Aptos Narrow" w:eastAsia="Aptos Narrow" w:hAnsi="Aptos Narrow" w:cs="Aptos Narrow"/>
+                <w:color w:val="000000" w:themeColor="text1"/>
+                <w:sz w:val="20"/>
+                <w:szCs w:val="20"/>
+              </w:rPr>
+            </w:pPr>
+            <w:r>
+              <w:rPr>
+                <w:rFonts w:ascii="Aptos Narrow" w:eastAsia="Aptos Narrow" w:hAnsi="Aptos Narrow" w:cs="Aptos Narrow"/>
+                <w:color w:val="000000" w:themeColor="text1"/>
+                <w:sz w:val="20"/>
+                <w:szCs w:val="20"/>
+              </w:rPr>
+              <w:t>8</w:t>
+            </w:r>
           </w:p>
         </w:tc>
         <w:tc>
@@ -3151,7 +3233,7 @@
         </w:trPr>
         <w:tc>
           <w:tcPr>
-            <w:tcW w:w="2694" w:type="dxa"/>
+            <w:tcW w:w="2880" w:type="dxa"/>
             <w:tcBorders>
               <w:top w:val="nil"/>
               <w:left w:val="nil"/>
@@ -3177,7 +3259,7 @@
         </w:tc>
         <w:tc>
           <w:tcPr>
-            <w:tcW w:w="780" w:type="dxa"/>
+            <w:tcW w:w="576" w:type="dxa"/>
             <w:tcBorders>
               <w:left w:val="single" w:sz="4" w:space="0" w:color="auto"/>
             </w:tcBorders>
@@ -3185,17 +3267,27 @@
               <w:left w:w="105" w:type="dxa"/>
               <w:right w:w="105" w:type="dxa"/>
             </w:tcMar>
-          </w:tcPr>
-          <w:p>
-            <w:pPr>
-              <w:jc w:val="center"/>
-              <w:rPr>
-                <w:rFonts w:ascii="Aptos Narrow" w:eastAsia="Aptos Narrow" w:hAnsi="Aptos Narrow" w:cs="Aptos Narrow"/>
-                <w:color w:val="000000" w:themeColor="text1"/>
-                <w:sz w:val="20"/>
-                <w:szCs w:val="20"/>
-              </w:rPr>
-            </w:pPr>
+            <w:vAlign w:val="center"/>
+          </w:tcPr>
+          <w:p>
+            <w:pPr>
+              <w:jc w:val="center"/>
+              <w:rPr>
+                <w:rFonts w:ascii="Aptos Narrow" w:eastAsia="Aptos Narrow" w:hAnsi="Aptos Narrow" w:cs="Aptos Narrow"/>
+                <w:color w:val="000000" w:themeColor="text1"/>
+                <w:sz w:val="20"/>
+                <w:szCs w:val="20"/>
+              </w:rPr>
+            </w:pPr>
+            <w:r>
+              <w:rPr>
+                <w:rFonts w:ascii="Aptos Narrow" w:eastAsia="Aptos Narrow" w:hAnsi="Aptos Narrow" w:cs="Aptos Narrow"/>
+                <w:color w:val="000000" w:themeColor="text1"/>
+                <w:sz w:val="20"/>
+                <w:szCs w:val="20"/>
+              </w:rPr>
+              <w:t>9</w:t>
+            </w:r>
           </w:p>
         </w:tc>
         <w:tc>
@@ -3370,7 +3462,7 @@
         </w:trPr>
         <w:tc>
           <w:tcPr>
-            <w:tcW w:w="2694" w:type="dxa"/>
+            <w:tcW w:w="2880" w:type="dxa"/>
             <w:tcBorders>
               <w:top w:val="nil"/>
               <w:left w:val="nil"/>
@@ -3396,7 +3488,7 @@
         </w:tc>
         <w:tc>
           <w:tcPr>
-            <w:tcW w:w="780" w:type="dxa"/>
+            <w:tcW w:w="576" w:type="dxa"/>
             <w:tcBorders>
               <w:left w:val="single" w:sz="4" w:space="0" w:color="auto"/>
             </w:tcBorders>
@@ -3404,17 +3496,27 @@
               <w:left w:w="105" w:type="dxa"/>
               <w:right w:w="105" w:type="dxa"/>
             </w:tcMar>
-          </w:tcPr>
-          <w:p>
-            <w:pPr>
-              <w:jc w:val="center"/>
-              <w:rPr>
-                <w:rFonts w:ascii="Aptos Narrow" w:eastAsia="Aptos Narrow" w:hAnsi="Aptos Narrow" w:cs="Aptos Narrow"/>
-                <w:color w:val="000000" w:themeColor="text1"/>
-                <w:sz w:val="20"/>
-                <w:szCs w:val="20"/>
-              </w:rPr>
-            </w:pPr>
+            <w:vAlign w:val="center"/>
+          </w:tcPr>
+          <w:p>
+            <w:pPr>
+              <w:jc w:val="center"/>
+              <w:rPr>
+                <w:rFonts w:ascii="Aptos Narrow" w:eastAsia="Aptos Narrow" w:hAnsi="Aptos Narrow" w:cs="Aptos Narrow"/>
+                <w:color w:val="000000" w:themeColor="text1"/>
+                <w:sz w:val="20"/>
+                <w:szCs w:val="20"/>
+              </w:rPr>
+            </w:pPr>
+            <w:r>
+              <w:rPr>
+                <w:rFonts w:ascii="Aptos Narrow" w:eastAsia="Aptos Narrow" w:hAnsi="Aptos Narrow" w:cs="Aptos Narrow"/>
+                <w:color w:val="000000" w:themeColor="text1"/>
+                <w:sz w:val="20"/>
+                <w:szCs w:val="20"/>
+              </w:rPr>
+              <w:t>10</w:t>
+            </w:r>
           </w:p>
         </w:tc>
         <w:tc>
@@ -3589,7 +3691,7 @@
         </w:trPr>
         <w:tc>
           <w:tcPr>
-            <w:tcW w:w="2694" w:type="dxa"/>
+            <w:tcW w:w="2880" w:type="dxa"/>
             <w:tcBorders>
               <w:top w:val="nil"/>
               <w:left w:val="nil"/>
@@ -3615,7 +3717,7 @@
         </w:tc>
         <w:tc>
           <w:tcPr>
-            <w:tcW w:w="780" w:type="dxa"/>
+            <w:tcW w:w="576" w:type="dxa"/>
             <w:tcBorders>
               <w:left w:val="single" w:sz="4" w:space="0" w:color="auto"/>
             </w:tcBorders>
@@ -3623,17 +3725,27 @@
               <w:left w:w="105" w:type="dxa"/>
               <w:right w:w="105" w:type="dxa"/>
             </w:tcMar>
-          </w:tcPr>
-          <w:p>
-            <w:pPr>
-              <w:jc w:val="center"/>
-              <w:rPr>
-                <w:rFonts w:ascii="Aptos Narrow" w:eastAsia="Aptos Narrow" w:hAnsi="Aptos Narrow" w:cs="Aptos Narrow"/>
-                <w:color w:val="000000" w:themeColor="text1"/>
-                <w:sz w:val="20"/>
-                <w:szCs w:val="20"/>
-              </w:rPr>
-            </w:pPr>
+            <w:vAlign w:val="center"/>
+          </w:tcPr>
+          <w:p>
+            <w:pPr>
+              <w:jc w:val="center"/>
+              <w:rPr>
+                <w:rFonts w:ascii="Aptos Narrow" w:eastAsia="Aptos Narrow" w:hAnsi="Aptos Narrow" w:cs="Aptos Narrow"/>
+                <w:color w:val="000000" w:themeColor="text1"/>
+                <w:sz w:val="20"/>
+                <w:szCs w:val="20"/>
+              </w:rPr>
+            </w:pPr>
+            <w:r>
+              <w:rPr>
+                <w:rFonts w:ascii="Aptos Narrow" w:eastAsia="Aptos Narrow" w:hAnsi="Aptos Narrow" w:cs="Aptos Narrow"/>
+                <w:color w:val="000000" w:themeColor="text1"/>
+                <w:sz w:val="20"/>
+                <w:szCs w:val="20"/>
+              </w:rPr>
+              <w:t>11</w:t>
+            </w:r>
           </w:p>
         </w:tc>
         <w:tc>
@@ -3808,7 +3920,7 @@
         </w:trPr>
         <w:tc>
           <w:tcPr>
-            <w:tcW w:w="2694" w:type="dxa"/>
+            <w:tcW w:w="2880" w:type="dxa"/>
             <w:tcBorders>
               <w:top w:val="nil"/>
               <w:left w:val="nil"/>
@@ -3834,7 +3946,7 @@
         </w:tc>
         <w:tc>
           <w:tcPr>
-            <w:tcW w:w="780" w:type="dxa"/>
+            <w:tcW w:w="576" w:type="dxa"/>
             <w:tcBorders>
               <w:left w:val="single" w:sz="4" w:space="0" w:color="auto"/>
             </w:tcBorders>
@@ -3842,17 +3954,27 @@
               <w:left w:w="105" w:type="dxa"/>
               <w:right w:w="105" w:type="dxa"/>
             </w:tcMar>
-          </w:tcPr>
-          <w:p>
-            <w:pPr>
-              <w:jc w:val="center"/>
-              <w:rPr>
-                <w:rFonts w:ascii="Aptos Narrow" w:eastAsia="Aptos Narrow" w:hAnsi="Aptos Narrow" w:cs="Aptos Narrow"/>
-                <w:color w:val="000000" w:themeColor="text1"/>
-                <w:sz w:val="20"/>
-                <w:szCs w:val="20"/>
-              </w:rPr>
-            </w:pPr>
+            <w:vAlign w:val="center"/>
+          </w:tcPr>
+          <w:p>
+            <w:pPr>
+              <w:jc w:val="center"/>
+              <w:rPr>
+                <w:rFonts w:ascii="Aptos Narrow" w:eastAsia="Aptos Narrow" w:hAnsi="Aptos Narrow" w:cs="Aptos Narrow"/>
+                <w:color w:val="000000" w:themeColor="text1"/>
+                <w:sz w:val="20"/>
+                <w:szCs w:val="20"/>
+              </w:rPr>
+            </w:pPr>
+            <w:r>
+              <w:rPr>
+                <w:rFonts w:ascii="Aptos Narrow" w:eastAsia="Aptos Narrow" w:hAnsi="Aptos Narrow" w:cs="Aptos Narrow"/>
+                <w:color w:val="000000" w:themeColor="text1"/>
+                <w:sz w:val="20"/>
+                <w:szCs w:val="20"/>
+              </w:rPr>
+              <w:t>12</w:t>
+            </w:r>
           </w:p>
         </w:tc>
         <w:tc>
@@ -4027,7 +4149,7 @@
         </w:trPr>
         <w:tc>
           <w:tcPr>
-            <w:tcW w:w="2694" w:type="dxa"/>
+            <w:tcW w:w="2880" w:type="dxa"/>
             <w:tcBorders>
               <w:top w:val="nil"/>
               <w:left w:val="nil"/>
@@ -4053,7 +4175,7 @@
         </w:tc>
         <w:tc>
           <w:tcPr>
-            <w:tcW w:w="780" w:type="dxa"/>
+            <w:tcW w:w="576" w:type="dxa"/>
             <w:tcBorders>
               <w:left w:val="single" w:sz="4" w:space="0" w:color="auto"/>
             </w:tcBorders>
@@ -4061,17 +4183,27 @@
               <w:left w:w="105" w:type="dxa"/>
               <w:right w:w="105" w:type="dxa"/>
             </w:tcMar>
-          </w:tcPr>
-          <w:p>
-            <w:pPr>
-              <w:jc w:val="center"/>
-              <w:rPr>
-                <w:rFonts w:ascii="Aptos Narrow" w:eastAsia="Aptos Narrow" w:hAnsi="Aptos Narrow" w:cs="Aptos Narrow"/>
-                <w:color w:val="000000" w:themeColor="text1"/>
-                <w:sz w:val="20"/>
-                <w:szCs w:val="20"/>
-              </w:rPr>
-            </w:pPr>
+            <w:vAlign w:val="center"/>
+          </w:tcPr>
+          <w:p>
+            <w:pPr>
+              <w:jc w:val="center"/>
+              <w:rPr>
+                <w:rFonts w:ascii="Aptos Narrow" w:eastAsia="Aptos Narrow" w:hAnsi="Aptos Narrow" w:cs="Aptos Narrow"/>
+                <w:color w:val="000000" w:themeColor="text1"/>
+                <w:sz w:val="20"/>
+                <w:szCs w:val="20"/>
+              </w:rPr>
+            </w:pPr>
+            <w:r>
+              <w:rPr>
+                <w:rFonts w:ascii="Aptos Narrow" w:eastAsia="Aptos Narrow" w:hAnsi="Aptos Narrow" w:cs="Aptos Narrow"/>
+                <w:color w:val="000000" w:themeColor="text1"/>
+                <w:sz w:val="20"/>
+                <w:szCs w:val="20"/>
+              </w:rPr>
+              <w:t>13</w:t>
+            </w:r>
           </w:p>
         </w:tc>
         <w:tc>
@@ -4246,7 +4378,7 @@
         </w:trPr>
         <w:tc>
           <w:tcPr>
-            <w:tcW w:w="2694" w:type="dxa"/>
+            <w:tcW w:w="2880" w:type="dxa"/>
             <w:tcBorders>
               <w:top w:val="nil"/>
               <w:left w:val="nil"/>
@@ -4272,7 +4404,7 @@
         </w:tc>
         <w:tc>
           <w:tcPr>
-            <w:tcW w:w="780" w:type="dxa"/>
+            <w:tcW w:w="576" w:type="dxa"/>
             <w:tcBorders>
               <w:left w:val="single" w:sz="4" w:space="0" w:color="auto"/>
             </w:tcBorders>
@@ -4280,17 +4412,27 @@
               <w:left w:w="105" w:type="dxa"/>
               <w:right w:w="105" w:type="dxa"/>
             </w:tcMar>
-          </w:tcPr>
-          <w:p>
-            <w:pPr>
-              <w:jc w:val="center"/>
-              <w:rPr>
-                <w:rFonts w:ascii="Aptos Narrow" w:eastAsia="Aptos Narrow" w:hAnsi="Aptos Narrow" w:cs="Aptos Narrow"/>
-                <w:color w:val="000000" w:themeColor="text1"/>
-                <w:sz w:val="20"/>
-                <w:szCs w:val="20"/>
-              </w:rPr>
-            </w:pPr>
+            <w:vAlign w:val="center"/>
+          </w:tcPr>
+          <w:p>
+            <w:pPr>
+              <w:jc w:val="center"/>
+              <w:rPr>
+                <w:rFonts w:ascii="Aptos Narrow" w:eastAsia="Aptos Narrow" w:hAnsi="Aptos Narrow" w:cs="Aptos Narrow"/>
+                <w:color w:val="000000" w:themeColor="text1"/>
+                <w:sz w:val="20"/>
+                <w:szCs w:val="20"/>
+              </w:rPr>
+            </w:pPr>
+            <w:r>
+              <w:rPr>
+                <w:rFonts w:ascii="Aptos Narrow" w:eastAsia="Aptos Narrow" w:hAnsi="Aptos Narrow" w:cs="Aptos Narrow"/>
+                <w:color w:val="000000" w:themeColor="text1"/>
+                <w:sz w:val="20"/>
+                <w:szCs w:val="20"/>
+              </w:rPr>
+              <w:t>14</w:t>
+            </w:r>
           </w:p>
         </w:tc>
         <w:tc>
@@ -4465,7 +4607,7 @@
         </w:trPr>
         <w:tc>
           <w:tcPr>
-            <w:tcW w:w="2694" w:type="dxa"/>
+            <w:tcW w:w="2880" w:type="dxa"/>
             <w:tcBorders>
               <w:top w:val="nil"/>
               <w:left w:val="nil"/>
@@ -4491,7 +4633,7 @@
         </w:tc>
         <w:tc>
           <w:tcPr>
-            <w:tcW w:w="780" w:type="dxa"/>
+            <w:tcW w:w="576" w:type="dxa"/>
             <w:tcBorders>
               <w:left w:val="single" w:sz="4" w:space="0" w:color="auto"/>
             </w:tcBorders>
@@ -4499,17 +4641,27 @@
               <w:left w:w="105" w:type="dxa"/>
               <w:right w:w="105" w:type="dxa"/>
             </w:tcMar>
-          </w:tcPr>
-          <w:p>
-            <w:pPr>
-              <w:jc w:val="center"/>
-              <w:rPr>
-                <w:rFonts w:ascii="Aptos Narrow" w:eastAsia="Aptos Narrow" w:hAnsi="Aptos Narrow" w:cs="Aptos Narrow"/>
-                <w:color w:val="000000" w:themeColor="text1"/>
-                <w:sz w:val="20"/>
-                <w:szCs w:val="20"/>
-              </w:rPr>
-            </w:pPr>
+            <w:vAlign w:val="center"/>
+          </w:tcPr>
+          <w:p>
+            <w:pPr>
+              <w:jc w:val="center"/>
+              <w:rPr>
+                <w:rFonts w:ascii="Aptos Narrow" w:eastAsia="Aptos Narrow" w:hAnsi="Aptos Narrow" w:cs="Aptos Narrow"/>
+                <w:color w:val="000000" w:themeColor="text1"/>
+                <w:sz w:val="20"/>
+                <w:szCs w:val="20"/>
+              </w:rPr>
+            </w:pPr>
+            <w:r>
+              <w:rPr>
+                <w:rFonts w:ascii="Aptos Narrow" w:eastAsia="Aptos Narrow" w:hAnsi="Aptos Narrow" w:cs="Aptos Narrow"/>
+                <w:color w:val="000000" w:themeColor="text1"/>
+                <w:sz w:val="20"/>
+                <w:szCs w:val="20"/>
+              </w:rPr>
+              <w:t>15</w:t>
+            </w:r>
           </w:p>
         </w:tc>
         <w:tc>
@@ -4684,7 +4836,7 @@
         </w:trPr>
         <w:tc>
           <w:tcPr>
-            <w:tcW w:w="2694" w:type="dxa"/>
+            <w:tcW w:w="2880" w:type="dxa"/>
             <w:tcBorders>
               <w:top w:val="nil"/>
               <w:left w:val="nil"/>
@@ -4710,7 +4862,7 @@
         </w:tc>
         <w:tc>
           <w:tcPr>
-            <w:tcW w:w="780" w:type="dxa"/>
+            <w:tcW w:w="576" w:type="dxa"/>
             <w:tcBorders>
               <w:left w:val="single" w:sz="4" w:space="0" w:color="auto"/>
             </w:tcBorders>
@@ -4718,17 +4870,27 @@
               <w:left w:w="105" w:type="dxa"/>
               <w:right w:w="105" w:type="dxa"/>
             </w:tcMar>
-          </w:tcPr>
-          <w:p>
-            <w:pPr>
-              <w:jc w:val="center"/>
-              <w:rPr>
-                <w:rFonts w:ascii="Aptos Narrow" w:eastAsia="Aptos Narrow" w:hAnsi="Aptos Narrow" w:cs="Aptos Narrow"/>
-                <w:color w:val="000000" w:themeColor="text1"/>
-                <w:sz w:val="20"/>
-                <w:szCs w:val="20"/>
-              </w:rPr>
-            </w:pPr>
+            <w:vAlign w:val="center"/>
+          </w:tcPr>
+          <w:p>
+            <w:pPr>
+              <w:jc w:val="center"/>
+              <w:rPr>
+                <w:rFonts w:ascii="Aptos Narrow" w:eastAsia="Aptos Narrow" w:hAnsi="Aptos Narrow" w:cs="Aptos Narrow"/>
+                <w:color w:val="000000" w:themeColor="text1"/>
+                <w:sz w:val="20"/>
+                <w:szCs w:val="20"/>
+              </w:rPr>
+            </w:pPr>
+            <w:r>
+              <w:rPr>
+                <w:rFonts w:ascii="Aptos Narrow" w:eastAsia="Aptos Narrow" w:hAnsi="Aptos Narrow" w:cs="Aptos Narrow"/>
+                <w:color w:val="000000" w:themeColor="text1"/>
+                <w:sz w:val="20"/>
+                <w:szCs w:val="20"/>
+              </w:rPr>
+              <w:t>16</w:t>
+            </w:r>
           </w:p>
         </w:tc>
         <w:tc>
@@ -4903,7 +5065,7 @@
         </w:trPr>
         <w:tc>
           <w:tcPr>
-            <w:tcW w:w="2694" w:type="dxa"/>
+            <w:tcW w:w="2880" w:type="dxa"/>
             <w:tcBorders>
               <w:top w:val="nil"/>
               <w:left w:val="nil"/>
@@ -4929,7 +5091,7 @@
         </w:tc>
         <w:tc>
           <w:tcPr>
-            <w:tcW w:w="780" w:type="dxa"/>
+            <w:tcW w:w="576" w:type="dxa"/>
             <w:tcBorders>
               <w:left w:val="single" w:sz="4" w:space="0" w:color="auto"/>
             </w:tcBorders>
@@ -4937,17 +5099,27 @@
               <w:left w:w="105" w:type="dxa"/>
               <w:right w:w="105" w:type="dxa"/>
             </w:tcMar>
-          </w:tcPr>
-          <w:p>
-            <w:pPr>
-              <w:jc w:val="center"/>
-              <w:rPr>
-                <w:rFonts w:ascii="Aptos Narrow" w:eastAsia="Aptos Narrow" w:hAnsi="Aptos Narrow" w:cs="Aptos Narrow"/>
-                <w:color w:val="000000" w:themeColor="text1"/>
-                <w:sz w:val="20"/>
-                <w:szCs w:val="20"/>
-              </w:rPr>
-            </w:pPr>
+            <w:vAlign w:val="center"/>
+          </w:tcPr>
+          <w:p>
+            <w:pPr>
+              <w:jc w:val="center"/>
+              <w:rPr>
+                <w:rFonts w:ascii="Aptos Narrow" w:eastAsia="Aptos Narrow" w:hAnsi="Aptos Narrow" w:cs="Aptos Narrow"/>
+                <w:color w:val="000000" w:themeColor="text1"/>
+                <w:sz w:val="20"/>
+                <w:szCs w:val="20"/>
+              </w:rPr>
+            </w:pPr>
+            <w:r>
+              <w:rPr>
+                <w:rFonts w:ascii="Aptos Narrow" w:eastAsia="Aptos Narrow" w:hAnsi="Aptos Narrow" w:cs="Aptos Narrow"/>
+                <w:color w:val="000000" w:themeColor="text1"/>
+                <w:sz w:val="20"/>
+                <w:szCs w:val="20"/>
+              </w:rPr>
+              <w:t>17</w:t>
+            </w:r>
           </w:p>
         </w:tc>
         <w:tc>
@@ -5122,7 +5294,7 @@
         </w:trPr>
         <w:tc>
           <w:tcPr>
-            <w:tcW w:w="2694" w:type="dxa"/>
+            <w:tcW w:w="2880" w:type="dxa"/>
             <w:tcBorders>
               <w:top w:val="nil"/>
               <w:left w:val="nil"/>
@@ -5148,7 +5320,7 @@
         </w:tc>
         <w:tc>
           <w:tcPr>
-            <w:tcW w:w="780" w:type="dxa"/>
+            <w:tcW w:w="576" w:type="dxa"/>
             <w:tcBorders>
               <w:left w:val="single" w:sz="4" w:space="0" w:color="auto"/>
             </w:tcBorders>
@@ -5156,17 +5328,27 @@
               <w:left w:w="105" w:type="dxa"/>
               <w:right w:w="105" w:type="dxa"/>
             </w:tcMar>
-          </w:tcPr>
-          <w:p>
-            <w:pPr>
-              <w:jc w:val="center"/>
-              <w:rPr>
-                <w:rFonts w:ascii="Aptos Narrow" w:eastAsia="Aptos Narrow" w:hAnsi="Aptos Narrow" w:cs="Aptos Narrow"/>
-                <w:color w:val="000000" w:themeColor="text1"/>
-                <w:sz w:val="20"/>
-                <w:szCs w:val="20"/>
-              </w:rPr>
-            </w:pPr>
+            <w:vAlign w:val="center"/>
+          </w:tcPr>
+          <w:p>
+            <w:pPr>
+              <w:jc w:val="center"/>
+              <w:rPr>
+                <w:rFonts w:ascii="Aptos Narrow" w:eastAsia="Aptos Narrow" w:hAnsi="Aptos Narrow" w:cs="Aptos Narrow"/>
+                <w:color w:val="000000" w:themeColor="text1"/>
+                <w:sz w:val="20"/>
+                <w:szCs w:val="20"/>
+              </w:rPr>
+            </w:pPr>
+            <w:r>
+              <w:rPr>
+                <w:rFonts w:ascii="Aptos Narrow" w:eastAsia="Aptos Narrow" w:hAnsi="Aptos Narrow" w:cs="Aptos Narrow"/>
+                <w:color w:val="000000" w:themeColor="text1"/>
+                <w:sz w:val="20"/>
+                <w:szCs w:val="20"/>
+              </w:rPr>
+              <w:t>18</w:t>
+            </w:r>
           </w:p>
         </w:tc>
         <w:tc>
@@ -5341,7 +5523,7 @@
         </w:trPr>
         <w:tc>
           <w:tcPr>
-            <w:tcW w:w="2694" w:type="dxa"/>
+            <w:tcW w:w="2880" w:type="dxa"/>
             <w:tcBorders>
               <w:top w:val="nil"/>
               <w:left w:val="nil"/>
@@ -5367,7 +5549,7 @@
         </w:tc>
         <w:tc>
           <w:tcPr>
-            <w:tcW w:w="780" w:type="dxa"/>
+            <w:tcW w:w="576" w:type="dxa"/>
             <w:tcBorders>
               <w:left w:val="single" w:sz="4" w:space="0" w:color="auto"/>
             </w:tcBorders>
@@ -5396,7 +5578,7 @@
                 <w:sz w:val="20"/>
                 <w:szCs w:val="20"/>
               </w:rPr>
-              <w:t>WYNIK</w:t>
+              <w:t>PKT</w:t>
             </w:r>
           </w:p>
         </w:tc>
@@ -5506,6 +5688,10 @@
     </w:sectPr>
   </w:body>
 </w:document>
+</file>
+
+<file path=word/numbering.xml><?xml version="1.0" encoding="utf-8"?>
+<w:numbering xmlns:wpc="http://schemas.microsoft.com/office/word/2010/wordprocessingCanvas" xmlns:cx="http://schemas.microsoft.com/office/drawing/2014/chartex" xmlns:cx1="http://schemas.microsoft.com/office/drawing/2015/9/8/chartex" xmlns:cx2="http://schemas.microsoft.com/office/drawing/2015/10/21/chartex" xmlns:cx3="http://schemas.microsoft.com/office/drawing/2016/5/9/chartex" xmlns:cx4="http://schemas.microsoft.com/office/drawing/2016/5/10/chartex" xmlns:cx5="http://schemas.microsoft.com/office/drawing/2016/5/11/chartex" xmlns:cx6="http://schemas.microsoft.com/office/drawing/2016/5/12/chartex" xmlns:cx7="http://schemas.microsoft.com/office/drawing/2016/5/13/chartex" xmlns:cx8="http://schemas.microsoft.com/office/drawing/2016/5/14/chartex" xmlns:mc="http://schemas.openxmlformats.org/markup-compatibility/2006" xmlns:aink="http://schemas.microsoft.com/office/drawing/2016/ink" xmlns:am3d="http://schemas.microsoft.com/office/drawing/2017/model3d" xmlns:o="urn:schemas-microsoft-com:office:office" xmlns:oel="http://schemas.microsoft.com/office/2019/extlst" xmlns:r="http://schemas.openxmlformats.org/officeDocument/2006/relationships" xmlns:m="http://schemas.openxmlformats.org/officeDocument/2006/math" xmlns:v="urn:schemas-microsoft-com:vml" xmlns:wp14="http://schemas.microsoft.com/office/word/2010/wordprocessingDrawing" xmlns:wp="http://schemas.openxmlformats.org/drawingml/2006/wordprocessingDrawing" xmlns:w10="urn:schemas-microsoft-com:office:word" xmlns:w="http://schemas.openxmlformats.org/wordprocessingml/2006/main" xmlns:w14="http://schemas.microsoft.com/office/word/2010/wordml" xmlns:w15="http://schemas.microsoft.com/office/word/2012/wordml" xmlns:w16cex="http://schemas.microsoft.com/office/word/2018/wordml/cex" xmlns:w16cid="http://schemas.microsoft.com/office/word/2016/wordml/cid" xmlns:w16="http://schemas.microsoft.com/office/word/2018/wordml" xmlns:w16du="http://schemas.microsoft.com/office/word/2023/wordml/word16du" xmlns:w16sdtdh="http://schemas.microsoft.com/office/word/2020/wordml/sdtdatahash" xmlns:w16sdtfl="http://schemas.microsoft.com/office/word/2024/wordml/sdtformatlock" xmlns:w16se="http://schemas.microsoft.com/office/word/2015/wordml/symex" xmlns:wpg="http://schemas.microsoft.com/office/word/2010/wordprocessingGroup" xmlns:wpi="http://schemas.microsoft.com/office/word/2010/wordprocessingInk" xmlns:wne="http://schemas.microsoft.com/office/word/2006/wordml" xmlns:wps="http://schemas.microsoft.com/office/word/2010/wordprocessingShape" mc:Ignorable="w14 w15 w16se w16cid w16 w16cex w16sdtdh w16sdtfl w16du wp14"/>
 </file>
 
 <file path=word/styles.xml><?xml version="1.0" encoding="utf-8"?>
@@ -6218,6 +6404,17 @@
 </file>
 
 <file path=customXml/item1.xml><?xml version="1.0" encoding="utf-8"?>
+<p:properties xmlns:p="http://schemas.microsoft.com/office/2006/metadata/properties" xmlns:xsi="http://www.w3.org/2001/XMLSchema-instance" xmlns:pc="http://schemas.microsoft.com/office/infopath/2007/PartnerControls">
+  <documentManagement>
+    <TaxCatchAll xmlns="6e3c809f-d77f-4965-8c59-52bc5988e08d" xsi:nil="true"/>
+    <lcf76f155ced4ddcb4097134ff3c332f xmlns="6011e175-94d7-470b-a25b-96e606435ba7">
+      <Terms xmlns="http://schemas.microsoft.com/office/infopath/2007/PartnerControls"/>
+    </lcf76f155ced4ddcb4097134ff3c332f>
+  </documentManagement>
+</p:properties>
+</file>
+
+<file path=customXml/item2.xml><?xml version="1.0" encoding="utf-8"?>
 <?mso-contentType ?>
 <FormTemplates xmlns="http://schemas.microsoft.com/sharepoint/v3/contenttype/forms">
   <Display>DocumentLibraryForm</Display>
@@ -6226,7 +6423,7 @@
 </FormTemplates>
 </file>
 
-<file path=customXml/item2.xml><?xml version="1.0" encoding="utf-8"?>
+<file path=customXml/item3.xml><?xml version="1.0" encoding="utf-8"?>
 <ct:contentTypeSchema xmlns:ct="http://schemas.microsoft.com/office/2006/metadata/contentType" xmlns:ma="http://schemas.microsoft.com/office/2006/metadata/properties/metaAttributes" ct:_="" ma:_="" ma:contentTypeName="Dokument" ma:contentTypeID="0x010100E02B0782D6F96B44A7C1A6483B3F88A5" ma:contentTypeVersion="10" ma:contentTypeDescription="Utwórz nowy dokument." ma:contentTypeScope="" ma:versionID="dafbd3aba1efe586ac978fd8b8b0afe5">
   <xsd:schema xmlns:xsd="http://www.w3.org/2001/XMLSchema" xmlns:xs="http://www.w3.org/2001/XMLSchema" xmlns:p="http://schemas.microsoft.com/office/2006/metadata/properties" xmlns:ns2="6011e175-94d7-470b-a25b-96e606435ba7" xmlns:ns3="6e3c809f-d77f-4965-8c59-52bc5988e08d" targetNamespace="http://schemas.microsoft.com/office/2006/metadata/properties" ma:root="true" ma:fieldsID="632b28c003267633fc74dc71523c1969" ns2:_="" ns3:_="">
     <xsd:import namespace="6011e175-94d7-470b-a25b-96e606435ba7"/>
@@ -6415,18 +6612,18 @@
 </ct:contentTypeSchema>
 </file>
 
-<file path=customXml/item3.xml><?xml version="1.0" encoding="utf-8"?>
-<p:properties xmlns:p="http://schemas.microsoft.com/office/2006/metadata/properties" xmlns:xsi="http://www.w3.org/2001/XMLSchema-instance" xmlns:pc="http://schemas.microsoft.com/office/infopath/2007/PartnerControls">
-  <documentManagement>
-    <TaxCatchAll xmlns="6e3c809f-d77f-4965-8c59-52bc5988e08d" xsi:nil="true"/>
-    <lcf76f155ced4ddcb4097134ff3c332f xmlns="6011e175-94d7-470b-a25b-96e606435ba7">
-      <Terms xmlns="http://schemas.microsoft.com/office/infopath/2007/PartnerControls"/>
-    </lcf76f155ced4ddcb4097134ff3c332f>
-  </documentManagement>
-</p:properties>
+<file path=customXml/itemProps1.xml><?xml version="1.0" encoding="utf-8"?>
+<ds:datastoreItem xmlns:ds="http://schemas.openxmlformats.org/officeDocument/2006/customXml" ds:itemID="{D1250B38-05D2-4495-BD86-DF85DBE4CE3A}">
+  <ds:schemaRefs>
+    <ds:schemaRef ds:uri="http://schemas.microsoft.com/office/2006/metadata/properties"/>
+    <ds:schemaRef ds:uri="http://schemas.microsoft.com/office/infopath/2007/PartnerControls"/>
+    <ds:schemaRef ds:uri="6e3c809f-d77f-4965-8c59-52bc5988e08d"/>
+    <ds:schemaRef ds:uri="6011e175-94d7-470b-a25b-96e606435ba7"/>
+  </ds:schemaRefs>
+</ds:datastoreItem>
 </file>
 
-<file path=customXml/itemProps1.xml><?xml version="1.0" encoding="utf-8"?>
+<file path=customXml/itemProps2.xml><?xml version="1.0" encoding="utf-8"?>
 <ds:datastoreItem xmlns:ds="http://schemas.openxmlformats.org/officeDocument/2006/customXml" ds:itemID="{7CBD2BD3-90DE-4AB6-91CE-6B3CC7002439}">
   <ds:schemaRefs>
     <ds:schemaRef ds:uri="http://schemas.microsoft.com/sharepoint/v3/contenttype/forms"/>
@@ -6434,7 +6631,7 @@
 </ds:datastoreItem>
 </file>
 
-<file path=customXml/itemProps2.xml><?xml version="1.0" encoding="utf-8"?>
+<file path=customXml/itemProps3.xml><?xml version="1.0" encoding="utf-8"?>
 <ds:datastoreItem xmlns:ds="http://schemas.openxmlformats.org/officeDocument/2006/customXml" ds:itemID="{8D075643-BC04-4701-AE66-86D30D057DE1}">
   <ds:schemaRefs>
     <ds:schemaRef ds:uri="http://schemas.microsoft.com/office/2006/metadata/contentType"/>
@@ -6451,21 +6648,4 @@
     <ds:schemaRef ds:uri="http://schemas.microsoft.com/internal/obd"/>
   </ds:schemaRefs>
 </ds:datastoreItem>
-</file>
-
-<file path=customXml/itemProps3.xml><?xml version="1.0" encoding="utf-8"?>
-<ds:datastoreItem xmlns:ds="http://schemas.openxmlformats.org/officeDocument/2006/customXml" ds:itemID="{D1250B38-05D2-4495-BD86-DF85DBE4CE3A}">
-  <ds:schemaRefs>
-    <ds:schemaRef ds:uri="http://purl.org/dc/dcmitype/"/>
-    <ds:schemaRef ds:uri="http://www.w3.org/XML/1998/namespace"/>
-    <ds:schemaRef ds:uri="http://schemas.openxmlformats.org/package/2006/metadata/core-properties"/>
-    <ds:schemaRef ds:uri="http://schemas.microsoft.com/office/infopath/2007/PartnerControls"/>
-    <ds:schemaRef ds:uri="http://schemas.microsoft.com/office/2006/documentManagement/types"/>
-    <ds:schemaRef ds:uri="http://purl.org/dc/terms/"/>
-    <ds:schemaRef ds:uri="6e3c809f-d77f-4965-8c59-52bc5988e08d"/>
-    <ds:schemaRef ds:uri="6011e175-94d7-470b-a25b-96e606435ba7"/>
-    <ds:schemaRef ds:uri="http://schemas.microsoft.com/office/2006/metadata/properties"/>
-    <ds:schemaRef ds:uri="http://purl.org/dc/elements/1.1/"/>
-  </ds:schemaRefs>
-</ds:datastoreItem>
 </file>
</xml_diff>